<commit_message>
feat: add NLP Session 4 training pipeline and update ignore rules for exam materials
</commit_message>
<xml_diff>
--- a/src/Repos.docx
+++ b/src/Repos.docx
@@ -32,6 +32,34 @@
         </w:r>
       </w:hyperlink>
     </w:p>
+    <w:p>
+      <w:hyperlink r:id="rId7" w:history="1">
+        <w:r>
+          <w:rPr>
+            <w:rStyle w:val="Hyperlink"/>
+          </w:rPr>
+          <w:t>https://github.com/Shubhamsaboo/awesome-llm-apps</w:t>
+        </w:r>
+      </w:hyperlink>
+    </w:p>
+    <w:p/>
+    <w:p>
+      <w:r>
+        <w:t>ITI-Preparation</w:t>
+      </w:r>
+    </w:p>
+    <w:p>
+      <w:hyperlink r:id="rId8" w:history="1">
+        <w:r>
+          <w:rPr>
+            <w:rStyle w:val="Hyperlink"/>
+          </w:rPr>
+          <w:t>https://www.linkedin.com/posts/mohamed-whdan_%D9%85%D9%86%D8%AD%D8%A9-iti-9-month-%D9%87%D8%AA%D9%81%D8%AA%D8%AD-%D8%A7%D9%84%D8%AA%D9%82%D8%AF%D9%8A%D9%85-%D9%82%D8%B1%D9%8A%D8%A8-%D9%88%D9%82%D8%A8%D9%84-share-7457762389329940480-CInM?utm_source=share&amp;utm_medium=member_android&amp;rcm=ACoAAEddp9YBeCu00SCP4HpiYBBc6wlkTmh-nEA</w:t>
+        </w:r>
+      </w:hyperlink>
+    </w:p>
+    <w:p/>
+    <w:p/>
     <w:p/>
     <w:sectPr>
       <w:pgSz w:w="12240" w:h="15840"/>

</xml_diff>